<commit_message>
Strip parentheses from the visualization requirements docx
Appositives become dashes, enumerations become interpuncts, asides become
their own sentences, and cross-references become arrows. 101 parentheses to
zero with the paragraph count unchanged at 339.

The file on disk was not the one I generated — it had been opened in Word and
the counterpart's name corrected to 이대규. Regenerating would have reverted
that, so the build script carries the correction now.

Co-Authored-By: Claude Opus 5 <noreply@anthropic.com>
</commit_message>
<xml_diff>
--- a/가시화 담당 요구사항 정의서.docx
+++ b/가시화 담당 요구사항 정의서.docx
@@ -32,7 +32,7 @@
         <w:rPr>
           <w:sz w:val="20"/>
         </w:rPr>
-        <w:t>상대 파트: 강대규 (OpenTelemetry 기반 관측 스택 백엔드)</w:t>
+        <w:t>상대 파트: 이대규 — OpenTelemetry 기반 관측 스택 백엔드</w:t>
       </w:r>
     </w:p>
     <w:p>
@@ -40,7 +40,7 @@
         <w:rPr>
           <w:sz w:val="20"/>
         </w:rPr>
-        <w:t>근거: 260818 회의록 §4 (공통 인터페이스 문서), 요구사항정의서 v0.2 §6</w:t>
+        <w:t>근거: 260818 회의록 §4 공통 인터페이스 문서, 요구사항정의서 v0.2 §6</w:t>
       </w:r>
     </w:p>
     <w:p>
@@ -48,7 +48,7 @@
         <w:rPr>
           <w:sz w:val="20"/>
         </w:rPr>
-        <w:t>상태: 초안 — 회신 요청 (§6)</w:t>
+        <w:t>상태: 초안 — 회신 요청 사항은 6장</w:t>
       </w:r>
     </w:p>
     <w:p>
@@ -63,7 +63,7 @@
         <w:rPr>
           <w:b w:val="0"/>
         </w:rPr>
-        <w:t>본 문서는 가시화 모듈이 관측 스택 백엔드로부터 "받아야 하는 것"과 "줘야 하는 것"을 정리한 것이다. 회의 §4에서 지목된 최대 리스크("각자 따로 만들면 통합하는 순간 안 맞는다")에 대응해, 확정된 사실이 아니라 논의 가능한 안(案)을 먼저 제시하는 형태로 작성했다. 특히 송신부는 우리가 필드안을 먼저 낸다.</w:t>
+        <w:t>본 문서는 가시화 모듈이 관측 스택 백엔드로부터 "받아야 하는 것"과 "줘야 하는 것"을 정리한 것이다. 회의 §4에서 지목된 최대 리스크, 즉 "각자 따로 만들면 통합하는 순간 안 맞는다"에 대응해 확정된 사실이 아니라 논의 가능한 안을 먼저 제시하는 형태로 작성했다. 특히 송신부는 우리가 필드안을 먼저 낸다.</w:t>
       </w:r>
     </w:p>
     <w:p>
@@ -95,7 +95,7 @@
         <w:pStyle w:val="ListBullet"/>
       </w:pPr>
       <w:r>
-        <w:t>가시화 모듈은 수집기·저장소를 만들지 않는다. 질의(pull)와 발행(push)만 한다.</w:t>
+        <w:t>가시화 모듈은 수집기·저장소를 만들지 않는다. 질의와 발행만 한다.</w:t>
       </w:r>
     </w:p>
     <w:p>
@@ -111,7 +111,7 @@
         <w:pStyle w:val="ListBullet"/>
       </w:pPr>
       <w:r>
-        <w:t>관측 스택 구현체(OTel / Prometheus / Grafana)는 DataSource 인터페이스 뒤에 은닉한다. 구현체가 교체되어도 화면 코드는 바뀌지 않는다.</w:t>
+        <w:t>관측 스택 구현체인 OTel·Prometheus·Grafana는 DataSource 인터페이스 뒤에 은닉한다. 구현체가 교체되어도 화면 코드는 바뀌지 않는다.</w:t>
       </w:r>
     </w:p>
     <w:p>
@@ -119,7 +119,7 @@
         <w:pStyle w:val="ListBullet"/>
       </w:pPr>
       <w:r>
-        <w:t>가시화 클라이언트는 브라우저에서 동작한다(웹/TypeScript 확정). 이 사실이 채널 선택에 제약을 만든다 — 브라우저는 raw MQTT(TCP)를 사용할 수 없다.</w:t>
+        <w:t>가시화 클라이언트는 브라우저에서 동작한다. 웹·TypeScript로 확정했다. 이 사실이 채널 선택에 제약을 만든다 — 브라우저는 raw MQTT를 사용할 수 없다.</w:t>
       </w:r>
     </w:p>
     <w:p>
@@ -182,7 +182,7 @@
                 <w:b/>
                 <w:sz w:val="18"/>
               </w:rPr>
-              <w:t>OTel (기록)</w:t>
+              <w:t>OTel · 기록</w:t>
             </w:r>
           </w:p>
         </w:tc>
@@ -198,7 +198,7 @@
                 <w:b/>
                 <w:sz w:val="18"/>
               </w:rPr>
-              <w:t>MQTT (전달)</w:t>
+              <w:t>MQTT · 전달</w:t>
             </w:r>
           </w:p>
         </w:tc>
@@ -277,7 +277,7 @@
                 <w:rFonts w:ascii="맑은 고딕" w:hAnsi="맑은 고딕" w:eastAsia="맑은 고딕"/>
                 <w:sz w:val="18"/>
               </w:rPr>
-              <w:t>허용 (샘플링·배치 전송이 전제)</w:t>
+              <w:t>허용. 샘플링·배치 전송이 전제</w:t>
             </w:r>
           </w:p>
         </w:tc>
@@ -292,7 +292,7 @@
                 <w:rFonts w:ascii="맑은 고딕" w:hAnsi="맑은 고딕" w:eastAsia="맑은 고딕"/>
                 <w:sz w:val="18"/>
               </w:rPr>
-              <w:t>불허 가능 (QoS 1 이상)</w:t>
+              <w:t>QoS 1 이상이면 불허 가능</w:t>
             </w:r>
           </w:p>
         </w:tc>
@@ -469,7 +469,7 @@
         <w:pStyle w:val="ListBullet"/>
       </w:pPr>
       <w:r>
-        <w:t>감사 기록을 MQTT로만 보내는 것 — 브로커는 저장소가 아니다. 구독하지 않은 시점의 메시지는 남지 않으므로 사후 질의가 불가능하고, 책임 소재 추적 요건(회의 §4 수문 예시)이 성립하지 않는다.</w:t>
+        <w:t>감사 기록을 MQTT로만 보내는 것 — 브로커는 저장소가 아니다. 구독하지 않은 시점의 메시지는 남지 않으므로 사후 질의가 불가능하고, 회의 §4 수문 예시가 요구한 책임 소재 추적이 성립하지 않는다.</w:t>
       </w:r>
     </w:p>
     <w:p>
@@ -484,7 +484,7 @@
         <w:rPr>
           <w:b w:val="0"/>
         </w:rPr>
-        <w:t>참고: AI 담당 요구사항 정의서는 "전송 채널은 백엔드가 정한 공통 브로커를 그대로 사용"이라고만 적었고, 그 브로커의 실체가 아직 정해지지 않았다. 가시화도 같은 브로커를 쓸 것이므로 이 확정은 두 파트 공통의 선행 조건이다(§6 Q9).</w:t>
+        <w:t>참고: AI 담당 요구사항 정의서는 "전송 채널은 백엔드가 정한 공통 브로커를 그대로 사용"이라고만 적었고, 그 브로커의 실체가 아직 정해지지 않았다. 가시화도 같은 브로커를 쓸 것이므로 이 확정은 두 파트 공통의 선행 조건이다. 6장 Q9 참조.</w:t>
       </w:r>
     </w:p>
     <w:p>
@@ -496,7 +496,7 @@
           <w:b/>
           <w:sz w:val="28"/>
         </w:rPr>
-        <w:t>2. 받아야 하는 것 (수신부: 백엔드 → 가시화)</w:t>
+        <w:t>2. 받아야 하는 것 — 수신부: 백엔드 → 가시화</w:t>
       </w:r>
     </w:p>
     <w:p>
@@ -568,7 +568,7 @@
                 <w:b/>
                 <w:sz w:val="18"/>
               </w:rPr>
-              <w:t>채널(제안)</w:t>
+              <w:t>채널 제안</w:t>
             </w:r>
           </w:p>
         </w:tc>
@@ -631,7 +631,7 @@
                 <w:rFonts w:ascii="맑은 고딕" w:hAnsi="맑은 고딕" w:eastAsia="맑은 고딕"/>
                 <w:sz w:val="18"/>
               </w:rPr>
-              <w:t>HTTP (pull)</w:t>
+              <w:t>HTTP 질의</w:t>
             </w:r>
           </w:p>
         </w:tc>
@@ -1050,7 +1050,7 @@
                 <w:rFonts w:ascii="맑은 고딕" w:hAnsi="맑은 고딕" w:eastAsia="맑은 고딕"/>
                 <w:sz w:val="18"/>
               </w:rPr>
-              <w:t>시각 기준(clock) 규약</w:t>
+              <w:t>시각 기준 규약</w:t>
             </w:r>
           </w:p>
         </w:tc>
@@ -1189,7 +1189,7 @@
                 <w:rFonts w:ascii="맑은 고딕" w:hAnsi="맑은 고딕" w:eastAsia="맑은 고딕"/>
                 <w:sz w:val="18"/>
               </w:rPr>
-              <w:t>미정 (D-2)</w:t>
+              <w:t>미정 → D-2</w:t>
             </w:r>
           </w:p>
         </w:tc>
@@ -1294,7 +1294,7 @@
         <w:pStyle w:val="ListBullet"/>
       </w:pPr>
       <w:r>
-        <w:t>엔드포인트 (환경별: 로컬 / 개발 / 운영)</w:t>
+        <w:t>엔드포인트 — 로컬 / 개발 / 운영 환경별 주소</w:t>
       </w:r>
     </w:p>
     <w:p>
@@ -1310,7 +1310,7 @@
         <w:pStyle w:val="ListBullet"/>
       </w:pPr>
       <w:r>
-        <w:t>인증 방식: none / basic / bearer / mtls 중 하나 + 시크릿 전달 경로. 자격 증명 값 자체는 가시화 설정 파일에 기록하지 않으며, 시크릿 저장소 참조 키만 받는다.</w:t>
+        <w:t>인증 방식: none / basic / bearer / mtls 중 하나와 시크릿 전달 경로. 자격 증명 값 자체는 가시화 설정 파일에 기록하지 않으며, 시크릿 저장소 참조 키만 받는다.</w:t>
       </w:r>
     </w:p>
     <w:p>
@@ -1334,7 +1334,7 @@
         <w:pStyle w:val="ListBullet"/>
       </w:pPr>
       <w:r>
-        <w:t>보존 기간·해상도: 원본 유지 기간, 다운샘플링 시점과 간격 (그래프의 기본 조회 범위가 여기서 결정됨)</w:t>
+        <w:t>보존 기간·해상도: 원본 유지 기간, 다운샘플링 시점과 간격. 그래프의 기본 조회 범위가 여기서 결정된다.</w:t>
       </w:r>
     </w:p>
     <w:p>
@@ -1346,7 +1346,7 @@
           <w:b/>
           <w:sz w:val="22"/>
         </w:rPr>
-        <w:t>2.3. I-2. 계층 식별자 ↔ 라벨 대응 규칙 (최우선)</w:t>
+        <w:t>2.3. I-2. 계층 식별자 ↔ 라벨 대응 규칙 — 최우선</w:t>
       </w:r>
     </w:p>
     <w:p>
@@ -1362,7 +1362,7 @@
         <w:pStyle w:val="ListBullet"/>
       </w:pPr>
       <w:r>
-        <w:t>Resource attribute / 메트릭 라벨의 명명 규약</w:t>
+        <w:t>Resource attribute와 메트릭 라벨의 명명 규약</w:t>
       </w:r>
     </w:p>
     <w:p>
@@ -1378,7 +1378,7 @@
         <w:pStyle w:val="ListBullet"/>
       </w:pPr>
       <w:r>
-        <w:t>메트릭 이름 규약(접두어 체계, 단위 표기)</w:t>
+        <w:t>메트릭 이름 규약 — 접두어 체계, 단위 표기</w:t>
       </w:r>
     </w:p>
     <w:p>
@@ -1386,7 +1386,7 @@
         <w:pStyle w:val="ListBullet"/>
       </w:pPr>
       <w:r>
-        <w:t>동일 대상이 여러 이름으로 나타날 수 있는지 여부 (별칭 존재 시 정규화 규칙)</w:t>
+        <w:t>동일 대상이 여러 이름으로 나타날 수 있는지 여부. 별칭이 있다면 정규화 규칙</w:t>
       </w:r>
     </w:p>
     <w:p>
@@ -1394,7 +1394,7 @@
         <w:rPr>
           <w:b w:val="0"/>
         </w:rPr>
-        <w:t>이 항목은 진나영 파트의 식별자 체계(컨테이너 ID ↔ 디스크립터 ID ↔ Entity ID)와 같은 문제의 다른 면이다. 세 파트가 각자 정하면 어긋나므로 3자 동시 확정을 요청한다.</w:t>
+        <w:t>이 항목은 진나영 파트의 식별자 체계, 즉 컨테이너 ID ↔ 디스크립터 ID ↔ Entity ID 대응과 같은 문제의 다른 면이다. 세 파트가 각자 정하면 어긋나므로 3자 동시 확정을 요청한다.</w:t>
       </w:r>
     </w:p>
     <w:p>
@@ -1406,7 +1406,7 @@
           <w:b/>
           <w:sz w:val="22"/>
         </w:rPr>
-        <w:t>2.4. I-4. 스트림 (고빈도 텔레메트리 / 영상)</w:t>
+        <w:t>2.4. I-4. 스트림 — 고빈도 텔레메트리와 영상</w:t>
       </w:r>
     </w:p>
     <w:tbl>
@@ -1544,7 +1544,7 @@
                 <w:rFonts w:ascii="맑은 고딕" w:hAnsi="맑은 고딕" w:eastAsia="맑은 고딕"/>
                 <w:sz w:val="18"/>
               </w:rPr>
-              <w:t>별도 스트림(RTSP / WebRTC / HLS)</w:t>
+              <w:t>별도 스트림 RTSP / WebRTC / HLS</w:t>
             </w:r>
           </w:p>
         </w:tc>
@@ -1591,7 +1591,7 @@
                 <w:rFonts w:ascii="맑은 고딕" w:hAnsi="맑은 고딕" w:eastAsia="맑은 고딕"/>
                 <w:sz w:val="18"/>
               </w:rPr>
-              <w:t>MQTT (frame_ref만)</w:t>
+              <w:t>MQTT로 frame_ref만 전달</w:t>
             </w:r>
           </w:p>
         </w:tc>
@@ -1622,7 +1622,7 @@
         <w:pStyle w:val="ListBullet"/>
       </w:pPr>
       <w:r>
-        <w:t>필요 정보: 전송 프로토콜, 엔드포인트 규약, 프레임 타임스탬프의 기준 시계, 백프레셔 정책(드롭 / 버퍼), 재연결 시 재개 방식</w:t>
+        <w:t>필요 정보: 전송 프로토콜, 엔드포인트 규약, 프레임 타임스탬프의 기준 시계, 소비자가 못 따라갈 때의 드롭·버퍼 정책, 재연결 시 재개 방식</w:t>
       </w:r>
     </w:p>
     <w:p>
@@ -1642,7 +1642,7 @@
           <w:b/>
           <w:sz w:val="22"/>
         </w:rPr>
-        <w:t>2.5. I-5 / I-6. 감사 로그 조회 · 권한 모델</w:t>
+        <w:t>2.5. I-5 / I-6. 감사 로그 조회와 권한 모델</w:t>
       </w:r>
     </w:p>
     <w:p>
@@ -1658,7 +1658,7 @@
         <w:pStyle w:val="ListBullet"/>
       </w:pPr>
       <w:r>
-        <w:t>필요 정보: 조회 API 주소, 필터 축(대상 / 기간 / 발행자 / 발행 경로), 페이징, 조회 권한 모델</w:t>
+        <w:t>필요 정보: 조회 API 주소, 필터 축인 대상·기간·발행자·발행 경로, 페이징, 조회 권한 모델</w:t>
       </w:r>
     </w:p>
     <w:p>
@@ -1666,7 +1666,7 @@
         <w:pStyle w:val="ListBullet"/>
       </w:pPr>
       <w:r>
-        <w:t>권한 모델: 역할 목록과 역할별 제어 권한 범위, 사용자 신원 확인 방식(SSO / 토큰), 현재 사용자 역할 조회 API. 최종 검증은 백엔드 책임이며 가시화 쪽 검증은 UX 목적의 사전 차단이다.</w:t>
+        <w:t>권한 모델: 역할 목록과 역할별 제어 권한 범위, SSO 또는 토큰 등 사용자 신원 확인 방식, 현재 사용자 역할 조회 API. 최종 검증은 백엔드 책임이며 가시화 쪽 검증은 UX 목적의 사전 차단이다.</w:t>
       </w:r>
     </w:p>
     <w:p>
@@ -1678,7 +1678,7 @@
           <w:b/>
           <w:sz w:val="22"/>
         </w:rPr>
-        <w:t>2.6. I-9 / I-10. 실시간 수신 경로 (신설 항목)</w:t>
+        <w:t>2.6. I-9 / I-10. 실시간 수신 경로 — 신설 항목</w:t>
       </w:r>
     </w:p>
     <w:p>
@@ -1686,7 +1686,7 @@
         <w:pStyle w:val="ListBullet"/>
       </w:pPr>
       <w:r>
-        <w:t>I-9: 가시화 클라이언트는 브라우저에서 동작하므로 raw MQTT를 사용할 수 없다. 브로커가 MQTT over WebSocket 리스너를 열어주거나, 백엔드 WebSocket 게이트웨이를 경유해야 한다. 이것이 정해지지 않으면 실시간 갱신 경로가 존재하지 않는다. (§4 D-2)</w:t>
+        <w:t>I-9: 가시화 클라이언트는 브라우저에서 동작하므로 raw MQTT를 사용할 수 없다. 브로커가 MQTT over WebSocket 리스너를 열어주거나, 백엔드 WebSocket 게이트웨이를 경유해야 한다. 이것이 정해지지 않으면 실시간 갱신 경로가 존재하지 않는다. 4장 D-2 참조.</w:t>
       </w:r>
     </w:p>
     <w:p>
@@ -1709,7 +1709,7 @@
         <w:rPr>
           <w:b/>
         </w:rPr>
-        <w:t>표준 입력 스키마 (백엔드/어댑터 → 가시화, MQTT 상태 메시지)</w:t>
+        <w:t>표준 입력 스키마 ① 상태 메시지 — 백엔드·어댑터 → 가시화, MQTT</w:t>
       </w:r>
     </w:p>
     <w:p>
@@ -1774,7 +1774,7 @@
           <w:rFonts w:ascii="Consolas" w:hAnsi="Consolas" w:eastAsia="Consolas"/>
           <w:sz w:val="18"/>
         </w:rPr>
-        <w:t xml:space="preserve">  "timestamp": "ISO8601 (ms 단위 포함)",</w:t>
+        <w:t xml:space="preserve">  "timestamp": "ISO8601, ms 단위 포함",</w:t>
       </w:r>
     </w:p>
     <w:p>
@@ -1813,7 +1813,7 @@
           <w:rFonts w:ascii="Consolas" w:hAnsi="Consolas" w:eastAsia="Consolas"/>
           <w:sz w:val="18"/>
         </w:rPr>
-        <w:t xml:space="preserve">  "quality": "number (0~1, 선택)",</w:t>
+        <w:t xml:space="preserve">  "quality": "number, 0~1, 선택",</w:t>
       </w:r>
     </w:p>
     <w:p>
@@ -1826,7 +1826,7 @@
           <w:rFonts w:ascii="Consolas" w:hAnsi="Consolas" w:eastAsia="Consolas"/>
           <w:sz w:val="18"/>
         </w:rPr>
-        <w:t xml:space="preserve">  "source_ref": "string (선택: 영상 프레임 등 원본 바이너리 참조 키)"</w:t>
+        <w:t xml:space="preserve">  "source_ref": "string, 선택. 영상 프레임 등 원본 바이너리 참조 키"</w:t>
       </w:r>
     </w:p>
     <w:p>
@@ -1852,7 +1852,7 @@
         <w:pStyle w:val="ListBullet"/>
       </w:pPr>
       <w:r>
-        <w:t>lifecycle이 not_deployed / unreachable 두 값을 구분하는 것이 요건이다. "의도적으로 배포하지 않은 것"과 "장애로 응답하지 않는 것"은 화면에서 다르게 표시되어야 한다.</w:t>
+        <w:t>lifecycle이 not_deployed와 unreachable을 구분하는 것이 요건이다. "의도적으로 배포하지 않은 것"과 "장애로 응답하지 않는 것"은 화면에서 다르게 표시되어야 한다.</w:t>
       </w:r>
     </w:p>
     <w:p>
@@ -1860,7 +1860,7 @@
         <w:pStyle w:val="ListBullet"/>
       </w:pPr>
       <w:r>
-        <w:t>원본 바이너리는 메시지에 싣지 않고 참조만 전달한다(AI 담당 문서의 frame_ref와 동일 방식).</w:t>
+        <w:t>원본 바이너리는 메시지에 싣지 않고 참조만 전달한다. AI 담당 문서의 frame_ref와 동일 방식이다.</w:t>
       </w:r>
     </w:p>
     <w:p>
@@ -1872,7 +1872,7 @@
           <w:b/>
           <w:sz w:val="28"/>
         </w:rPr>
-        <w:t>3. 줘야 하는 것 (송신부: 가시화 → 백엔드)</w:t>
+        <w:t>3. 줘야 하는 것 — 송신부: 가시화 → 백엔드</w:t>
       </w:r>
     </w:p>
     <w:p>
@@ -1944,7 +1944,7 @@
                 <w:b/>
                 <w:sz w:val="18"/>
               </w:rPr>
-              <w:t>채널(제안)</w:t>
+              <w:t>채널 제안</w:t>
             </w:r>
           </w:p>
         </w:tc>
@@ -2007,7 +2007,7 @@
                 <w:rFonts w:ascii="맑은 고딕" w:hAnsi="맑은 고딕" w:eastAsia="맑은 고딕"/>
                 <w:sz w:val="18"/>
               </w:rPr>
-              <w:t>MQTT (QoS 1 이상) 또는 백엔드 HTTP API</w:t>
+              <w:t>MQTT QoS 1 이상 또는 백엔드 HTTP API</w:t>
             </w:r>
           </w:p>
         </w:tc>
@@ -2193,7 +2193,7 @@
                 <w:rFonts w:ascii="맑은 고딕" w:hAnsi="맑은 고딕" w:eastAsia="맑은 고딕"/>
                 <w:sz w:val="18"/>
               </w:rPr>
-              <w:t>OTel (OTLP/HTTP)</w:t>
+              <w:t>OTel · OTLP/HTTP</w:t>
             </w:r>
           </w:p>
         </w:tc>
@@ -2255,7 +2255,7 @@
                 <w:rFonts w:ascii="맑은 고딕" w:hAnsi="맑은 고딕" w:eastAsia="맑은 고딕"/>
                 <w:sz w:val="18"/>
               </w:rPr>
-              <w:t>채널 아님 (파일 공유)</w:t>
+              <w:t>채널 아님. 파일 공유</w:t>
             </w:r>
           </w:p>
         </w:tc>
@@ -2302,7 +2302,7 @@
                 <w:rFonts w:ascii="맑은 고딕" w:hAnsi="맑은 고딕" w:eastAsia="맑은 고딕"/>
                 <w:sz w:val="18"/>
               </w:rPr>
-              <w:t>그래프 구성 반영(commit) 기록</w:t>
+              <w:t>그래프 구성 반영 기록</w:t>
             </w:r>
           </w:p>
         </w:tc>
@@ -2375,7 +2375,7 @@
         <w:rPr>
           <w:b/>
         </w:rPr>
-        <w:t>표준 출력 스키마 ① 명령 전달 (가시화 → 브로커, MQTT 페이로드)</w:t>
+        <w:t>표준 출력 스키마 ② 명령 전달 — 가시화 → 브로커, MQTT 페이로드</w:t>
       </w:r>
     </w:p>
     <w:p>
@@ -2401,7 +2401,7 @@
           <w:rFonts w:ascii="Consolas" w:hAnsi="Consolas" w:eastAsia="Consolas"/>
           <w:sz w:val="18"/>
         </w:rPr>
-        <w:t xml:space="preserve">  "command_id": "string (UUID)",</w:t>
+        <w:t xml:space="preserve">  "command_id": "string, UUID",</w:t>
       </w:r>
     </w:p>
     <w:p>
@@ -2414,7 +2414,7 @@
           <w:rFonts w:ascii="Consolas" w:hAnsi="Consolas" w:eastAsia="Consolas"/>
           <w:sz w:val="18"/>
         </w:rPr>
-        <w:t xml:space="preserve">  "timestamp": "ISO8601 (ms 단위 포함)",</w:t>
+        <w:t xml:space="preserve">  "timestamp": "ISO8601, ms 단위 포함",</w:t>
       </w:r>
     </w:p>
     <w:p>
@@ -2440,7 +2440,7 @@
           <w:rFonts w:ascii="Consolas" w:hAnsi="Consolas" w:eastAsia="Consolas"/>
           <w:sz w:val="18"/>
         </w:rPr>
-        <w:t xml:space="preserve">  "action": "string (선언된 제어 액션 ID)",</w:t>
+        <w:t xml:space="preserve">  "action": "string. 선언된 제어 액션 ID",</w:t>
       </w:r>
     </w:p>
     <w:p>
@@ -2492,7 +2492,7 @@
           <w:rFonts w:ascii="Consolas" w:hAnsi="Consolas" w:eastAsia="Consolas"/>
           <w:sz w:val="18"/>
         </w:rPr>
-        <w:t xml:space="preserve">  "expires_at": "ISO8601 (이 시각 이후 도착 시 실행 금지)",</w:t>
+        <w:t xml:space="preserve">  "expires_at": "ISO8601. 이 시각 이후 도착 시 실행 금지",</w:t>
       </w:r>
     </w:p>
     <w:p>
@@ -2505,7 +2505,7 @@
           <w:rFonts w:ascii="Consolas" w:hAnsi="Consolas" w:eastAsia="Consolas"/>
           <w:sz w:val="18"/>
         </w:rPr>
-        <w:t xml:space="preserve">  "reply_to": "string (결과를 받을 토픽)"</w:t>
+        <w:t xml:space="preserve">  "reply_to": "string. 결과를 받을 토픽"</w:t>
       </w:r>
     </w:p>
     <w:p>
@@ -2539,7 +2539,7 @@
         <w:pStyle w:val="ListBullet"/>
       </w:pPr>
       <w:r>
-        <w:t>origin_path는 전달 페이로드와 감사 기록 양쪽에 모두 넣는다. 백엔드가 발행 경로에 따라 다른 정책(예: 음성 명령은 확인 필수)을 적용할 여지를 남긴다.</w:t>
+        <w:t>origin_path는 전달 페이로드와 감사 기록 양쪽에 모두 넣는다. 백엔드가 발행 경로에 따라 다른 정책을 적용할 여지를 남긴다. 예를 들어 음성 명령만 확인 절차를 강제하는 식이다.</w:t>
       </w:r>
     </w:p>
     <w:p>
@@ -2554,7 +2554,7 @@
         <w:rPr>
           <w:b/>
         </w:rPr>
-        <w:t>표준 입력 스키마 ② 명령 결과 (백엔드 → 가시화, reply_to 토픽)</w:t>
+        <w:t>표준 입력 스키마 ③ 명령 결과 — 백엔드 → 가시화, reply_to 토픽</w:t>
       </w:r>
     </w:p>
     <w:p>
@@ -2619,7 +2619,7 @@
           <w:rFonts w:ascii="Consolas" w:hAnsi="Consolas" w:eastAsia="Consolas"/>
           <w:sz w:val="18"/>
         </w:rPr>
-        <w:t xml:space="preserve">  "reason": "string (rejected/failed 시 사유)",</w:t>
+        <w:t xml:space="preserve">  "reason": "string. rejected·failed 시 사유",</w:t>
       </w:r>
     </w:p>
     <w:p>
@@ -2632,7 +2632,7 @@
           <w:rFonts w:ascii="Consolas" w:hAnsi="Consolas" w:eastAsia="Consolas"/>
           <w:sz w:val="18"/>
         </w:rPr>
-        <w:t xml:space="preserve">  "executed_by": "string (실행 주체 식별자)"</w:t>
+        <w:t xml:space="preserve">  "executed_by": "string. 실행 주체 식별자"</w:t>
       </w:r>
     </w:p>
     <w:p>
@@ -2665,7 +2665,7 @@
         <w:rPr>
           <w:b/>
         </w:rPr>
-        <w:t>표준 출력 스키마 ③ 감사 기록 (가시화 → OTel Log Record 속성)</w:t>
+        <w:t>표준 출력 스키마 ④ 감사 기록 — 가시화 → OTel Log Record 속성</w:t>
       </w:r>
     </w:p>
     <w:p>
@@ -2717,7 +2717,7 @@
           <w:rFonts w:ascii="Consolas" w:hAnsi="Consolas" w:eastAsia="Consolas"/>
           <w:sz w:val="18"/>
         </w:rPr>
-        <w:t xml:space="preserve">  "command.id": "string  (전달 페이로드의 command_id와 동일)",</w:t>
+        <w:t xml:space="preserve">  "command.id": "string. 전달 페이로드의 command_id와 동일",</w:t>
       </w:r>
     </w:p>
     <w:p>
@@ -2769,7 +2769,7 @@
           <w:rFonts w:ascii="Consolas" w:hAnsi="Consolas" w:eastAsia="Consolas"/>
           <w:sz w:val="18"/>
         </w:rPr>
-        <w:t xml:space="preserve">  "origin.client": "string (화면·단말 식별자)",</w:t>
+        <w:t xml:space="preserve">  "origin.client": "string. 화면·단말 식별자",</w:t>
       </w:r>
     </w:p>
     <w:p>
@@ -2847,7 +2847,7 @@
           <w:rFonts w:ascii="Consolas" w:hAnsi="Consolas" w:eastAsia="Consolas"/>
           <w:sz w:val="18"/>
         </w:rPr>
-        <w:t xml:space="preserve">  "action.paramsValid": "bool (클라이언트 1차 검증 통과 여부)",</w:t>
+        <w:t xml:space="preserve">  "action.paramsValid": "bool. 클라이언트 1차 검증 통과 여부",</w:t>
       </w:r>
     </w:p>
     <w:p>
@@ -2860,7 +2860,7 @@
           <w:rFonts w:ascii="Consolas" w:hAnsi="Consolas" w:eastAsia="Consolas"/>
           <w:sz w:val="18"/>
         </w:rPr>
-        <w:t xml:space="preserve">  "result.status": "accepted | rejected | timeout | failed  (결과 확정 시 후속 이벤트)",</w:t>
+        <w:t xml:space="preserve">  "result.status": "accepted | rejected | timeout | failed — 결과 확정 시 후속 이벤트",</w:t>
       </w:r>
     </w:p>
     <w:p>
@@ -2873,7 +2873,7 @@
           <w:rFonts w:ascii="Consolas" w:hAnsi="Consolas" w:eastAsia="Consolas"/>
           <w:sz w:val="18"/>
         </w:rPr>
-        <w:t xml:space="preserve">  "voice.transcript": "string  (origin.path=voice일 때 필수)",</w:t>
+        <w:t xml:space="preserve">  "voice.transcript": "string — origin.path=voice일 때 필수",</w:t>
       </w:r>
     </w:p>
     <w:p>
@@ -2899,7 +2899,7 @@
           <w:rFonts w:ascii="Consolas" w:hAnsi="Consolas" w:eastAsia="Consolas"/>
           <w:sz w:val="18"/>
         </w:rPr>
-        <w:t xml:space="preserve">  "llm.model": "string  (origin.path=llm_suggestion일 때 필수)",</w:t>
+        <w:t xml:space="preserve">  "llm.model": "string — origin.path=llm_suggestion일 때 필수",</w:t>
       </w:r>
     </w:p>
     <w:p>
@@ -2925,7 +2925,7 @@
           <w:rFonts w:ascii="Consolas" w:hAnsi="Consolas" w:eastAsia="Consolas"/>
           <w:sz w:val="18"/>
         </w:rPr>
-        <w:t xml:space="preserve">  "llm.userModified": "bool (제안을 수정한 뒤 수락했는지)",</w:t>
+        <w:t xml:space="preserve">  "llm.userModified": "bool. 제안을 수정한 뒤 수락했는지",</w:t>
       </w:r>
     </w:p>
     <w:p>
@@ -3008,7 +3008,7 @@
         <w:pStyle w:val="ListBullet"/>
       </w:pPr>
       <w:r>
-        <w:t>성능 요건의 목표 수치는 고정값 대신 SLA로 관리한다. 실측값을 OTel 지표로 지속 비교한다. (AI 담당 문서의 지연 관리 방식과 동일한 접근)</w:t>
+        <w:t>성능 요건의 목표 수치는 고정값 대신 SLA로 관리한다. 실측값을 OTel 지표로 지속 비교한다. AI 담당 문서의 지연 관리 방식과 같은 접근이다.</w:t>
       </w:r>
     </w:p>
     <w:p>
@@ -3020,7 +3020,7 @@
           <w:b/>
           <w:sz w:val="22"/>
         </w:rPr>
-        <w:t>3.4. O-5. 그래프 구성 반영 기록 (신설 항목)</w:t>
+        <w:t>3.4. O-5. 그래프 구성 반영 기록 — 신설 항목</w:t>
       </w:r>
     </w:p>
     <w:p>
@@ -3156,7 +3156,7 @@
                 <w:rFonts w:ascii="맑은 고딕" w:hAnsi="맑은 고딕" w:eastAsia="맑은 고딕"/>
                 <w:sz w:val="18"/>
               </w:rPr>
-              <w:t>제어 명령 전달 채널: MQTT / 백엔드 HTTP API / (OTel은 불가)</w:t>
+              <w:t>제어 명령 전달 채널: MQTT / 백엔드 HTTP API. OTel은 불가</w:t>
             </w:r>
           </w:p>
         </w:tc>
@@ -3233,7 +3233,7 @@
                 <w:rFonts w:ascii="맑은 고딕" w:hAnsi="맑은 고딕" w:eastAsia="맑은 고딕"/>
                 <w:sz w:val="18"/>
               </w:rPr>
-              <w:t>게이트웨이 경유 (브로커 자격 증명을 브라우저에 내리지 않기 위해)</w:t>
+              <w:t>게이트웨이 경유. 브로커 자격 증명을 브라우저에 내리지 않기 위해</w:t>
             </w:r>
           </w:p>
         </w:tc>
@@ -3357,7 +3357,7 @@
                 <w:rFonts w:ascii="맑은 고딕" w:hAnsi="맑은 고딕" w:eastAsia="맑은 고딕"/>
                 <w:sz w:val="18"/>
               </w:rPr>
-              <w:t>채택 (AI 담당 문서와 동일 방식)</w:t>
+              <w:t>채택. AI 담당 문서와 동일 방식</w:t>
             </w:r>
           </w:p>
         </w:tc>
@@ -3466,7 +3466,7 @@
                 <w:rFonts w:ascii="맑은 고딕" w:hAnsi="맑은 고딕" w:eastAsia="맑은 고딕"/>
                 <w:sz w:val="18"/>
               </w:rPr>
-              <w:t>브라우저 → OTel Collector 직접 OTLP 허용(CORS) / 게이트웨이 경유</w:t>
+              <w:t>브라우저 → OTel Collector 직접 OTLP 허용 여부. CORS 포함</w:t>
             </w:r>
           </w:p>
         </w:tc>
@@ -3481,7 +3481,7 @@
                 <w:rFonts w:ascii="맑은 고딕" w:hAnsi="맑은 고딕" w:eastAsia="맑은 고딕"/>
                 <w:sz w:val="18"/>
               </w:rPr>
-              <w:t>게이트웨이 경유 (D-2와 같은 이유)</w:t>
+              <w:t>게이트웨이 경유. D-2와 같은 이유</w:t>
             </w:r>
           </w:p>
         </w:tc>
@@ -3605,7 +3605,7 @@
                 <w:rFonts w:ascii="맑은 고딕" w:hAnsi="맑은 고딕" w:eastAsia="맑은 고딕"/>
                 <w:sz w:val="18"/>
               </w:rPr>
-              <w:t>있으면 그것을 사용 (이중 발행 회피)</w:t>
+              <w:t>있으면 그것을 사용해 이중 발행을 피한다</w:t>
             </w:r>
           </w:p>
         </w:tc>
@@ -3648,7 +3648,7 @@
           <w:b/>
           <w:sz w:val="28"/>
         </w:rPr>
-        <w:t>5. 표준 프로토콜 (명명 규약 제안)</w:t>
+        <w:t>5. 표준 프로토콜 — 명명 규약 제안</w:t>
       </w:r>
     </w:p>
     <w:p>
@@ -3681,7 +3681,7 @@
           <w:rFonts w:ascii="Consolas" w:hAnsi="Consolas" w:eastAsia="Consolas"/>
           <w:sz w:val="18"/>
         </w:rPr>
-        <w:t>{domain}/{zone}/{node}/{entity}/state/{signal}       # 상태 (retained)</w:t>
+        <w:t>{domain}/{zone}/{node}/{entity}/state/{signal}       # 상태. retained</w:t>
       </w:r>
     </w:p>
     <w:p>
@@ -3707,7 +3707,7 @@
           <w:rFonts w:ascii="Consolas" w:hAnsi="Consolas" w:eastAsia="Consolas"/>
           <w:sz w:val="18"/>
         </w:rPr>
-        <w:t>{domain}/{zone}/{node}/{entity}/cmd/{action}         # 제어 명령 (가시화 → 백엔드)</w:t>
+        <w:t>{domain}/{zone}/{node}/{entity}/cmd/{action}         # 제어 명령. 가시화 → 백엔드</w:t>
       </w:r>
     </w:p>
     <w:p>
@@ -3745,7 +3745,7 @@
         <w:rPr>
           <w:b w:val="0"/>
         </w:rPr>
-        <w:t>AI 파트가 ai.* 네임스페이스를 사용하므로 가시화는 viz.*를 사용한다. 라벨에 zone·domain을 공통 포함하는 규칙도 AI 담당 문서(3.4)와 동일하게 맞춘다.</w:t>
+        <w:t>AI 파트가 ai.* 네임스페이스를 사용하므로 가시화는 viz.*를 사용한다. 라벨에 zone·domain을 공통 포함하는 규칙도 AI 담당 문서 3.4절과 동일하게 맞춘다.</w:t>
       </w:r>
     </w:p>
     <w:p>
@@ -3836,7 +3836,7 @@
           <w:rFonts w:ascii="Consolas" w:hAnsi="Consolas" w:eastAsia="Consolas"/>
           <w:sz w:val="18"/>
         </w:rPr>
-        <w:t>viz.control.command_issued           # counter, 라벨: origin.path</w:t>
+        <w:t>viz.control.command_issued           # counter. 라벨: origin.path</w:t>
       </w:r>
     </w:p>
     <w:p>
@@ -3873,7 +3873,7 @@
         <w:pStyle w:val="ListBullet"/>
       </w:pPr>
       <w:r>
-        <w:t>Q1. 제어 명령 감사 이벤트를 OTel Log / Span Event / 별도 API 중 무엇으로 받겠는가? (D-7)</w:t>
+        <w:t>Q1. 제어 명령 감사 이벤트를 OTel Log / Span Event / 별도 API 중 무엇으로 받겠는가? → D-7</w:t>
       </w:r>
     </w:p>
     <w:p>
@@ -3881,7 +3881,7 @@
         <w:pStyle w:val="ListBullet"/>
       </w:pPr>
       <w:r>
-        <w:t>Q2. 제안한 감사 필드 중 빼야 할 것 / 이름을 바꿔야 할 것이 있는가? 특히 OTel semantic convention에 이미 대응 이름이 있는 필드.</w:t>
+        <w:t>Q2. 제안한 감사 필드 중 빼야 할 것이나 이름을 바꿔야 할 것이 있는가? 특히 OTel semantic convention에 이미 대응 이름이 있는 필드.</w:t>
       </w:r>
     </w:p>
     <w:p>
@@ -3897,7 +3897,7 @@
         <w:pStyle w:val="ListBullet"/>
       </w:pPr>
       <w:r>
-        <w:t>Q4. Zone / Node / Entity를 어떤 resource attribute·라벨로 표현할 것인가? 진나영 파트의 컨테이너 식별자 체계와는 어떻게 잇는가? (I-2)</w:t>
+        <w:t>Q4. Zone / Node / Entity를 어떤 resource attribute·라벨로 표현할 것인가? 진나영 파트의 컨테이너 식별자 체계와는 어떻게 잇는가? → I-2</w:t>
       </w:r>
     </w:p>
     <w:p>
@@ -3905,7 +3905,7 @@
         <w:pStyle w:val="ListBullet"/>
       </w:pPr>
       <w:r>
-        <w:t>Q5. 감사 로그를 되읽는 조회 API를 제공할 계획이 있는가? 없다면 "마지막으로 누가 조작했는지"를 화면에 표시할 수 없다. (I-5)</w:t>
+        <w:t>Q5. 감사 로그를 되읽는 조회 API를 제공할 계획이 있는가? 없다면 "마지막으로 누가 조작했는지"를 화면에 표시할 수 없다. → I-5</w:t>
       </w:r>
     </w:p>
     <w:p>
@@ -3913,7 +3913,7 @@
         <w:pStyle w:val="ListBullet"/>
       </w:pPr>
       <w:r>
-        <w:t>Q6. 영상 스트림이 관측 스택을 경유하는가, 하드웨어 파트에서 가시화로 직접 오는가? (I-4b)</w:t>
+        <w:t>Q6. 영상 스트림이 관측 스택을 경유하는가, 하드웨어 파트에서 가시화로 직접 오는가? → I-4b</w:t>
       </w:r>
     </w:p>
     <w:p>
@@ -3921,7 +3921,7 @@
         <w:pStyle w:val="ListBullet"/>
       </w:pPr>
       <w:r>
-        <w:t>Q7. 메트릭 중 이미 집약된 것과 원본을 구분해 알려줄 수 있는가? (I-8)</w:t>
+        <w:t>Q7. 메트릭 중 이미 집약된 것과 원본을 구분해 알려줄 수 있는가? → I-8</w:t>
       </w:r>
     </w:p>
     <w:p>
@@ -3949,7 +3949,7 @@
         <w:pStyle w:val="ListBullet"/>
       </w:pPr>
       <w:r>
-        <w:t>Q9. "공통 브로커"의 실체가 무엇인가? 제품(Mosquitto / EMQX / NanoMQ 등), MQTT 버전(3.1.1 / 5.0), 배치 위치. AI 담당 문서도 "백엔드가 정한 공통 브로커"라고만 적혀 있어 두 파트가 함께 대기 중이다. (D-1)</w:t>
+        <w:t>Q9. "공통 브로커"의 실체가 무엇인가? 제품은 Mosquitto·EMQX·NanoMQ 중 어느 것인지, MQTT 버전은 3.1.1인지 5.0인지, 어디에 배치되는지. AI 담당 문서도 "백엔드가 정한 공통 브로커"라고만 적혀 있어 두 파트가 함께 대기 중이다. → D-1</w:t>
       </w:r>
     </w:p>
     <w:p>
@@ -3957,7 +3957,7 @@
         <w:pStyle w:val="ListBullet"/>
       </w:pPr>
       <w:r>
-        <w:t>Q10. 브로커가 WebSocket 리스너를 열어주는가? TLS 적용 여부는? 아니면 백엔드 WebSocket 게이트웨이를 경유해야 하는가? (D-2, I-9)</w:t>
+        <w:t>Q10. 브로커가 WebSocket 리스너를 열어주는가? TLS 적용 여부는? 아니면 백엔드 WebSocket 게이트웨이를 경유해야 하는가? → D-2, I-9</w:t>
       </w:r>
     </w:p>
     <w:p>
@@ -3965,7 +3965,7 @@
         <w:pStyle w:val="ListBullet"/>
       </w:pPr>
       <w:r>
-        <w:t>Q11. 브로커의 인증·ACL 모델은 무엇인가? 브라우저 클라이언트에 자격 증명을 어떻게 발급하는가(단명 토큰 발급 경로가 있는가)? 브로커 계정을 프런트엔드에 하드코딩하는 방식은 사용하지 않겠다.</w:t>
+        <w:t>Q11. 브로커의 인증·ACL 모델은 무엇인가? 브라우저 클라이언트에 자격 증명을 어떻게 발급하는가? 단명 토큰 발급 경로가 있는지 확인이 필요하다. 브로커 계정을 프런트엔드에 하드코딩하는 방식은 사용하지 않겠다.</w:t>
       </w:r>
     </w:p>
     <w:p>
@@ -3973,7 +3973,7 @@
         <w:pStyle w:val="ListBullet"/>
       </w:pPr>
       <w:r>
-        <w:t>Q12. 토픽 네임스페이스를 누가 소유·승인하는가? 가시화가 토픽을 제안해도 되는가, 정해진 것을 받아야 하는가? (D-3)</w:t>
+        <w:t>Q12. 토픽 네임스페이스를 누가 소유·승인하는가? 가시화가 토픽을 제안해도 되는가, 정해진 것을 받아야 하는가? → D-3</w:t>
       </w:r>
     </w:p>
     <w:p>
@@ -3981,7 +3981,7 @@
         <w:pStyle w:val="ListBullet"/>
       </w:pPr>
       <w:r>
-        <w:t>Q13. QoS 기본값, retained 사용 정책, 메시지 최대 크기는? 특히 상태 토픽의 retained 사용 가능 여부가 "의도적 미배포 vs 장애" 구분 표시에 직접 영향을 준다. (D-5, I-10)</w:t>
+        <w:t>Q13. QoS 기본값, retained 사용 정책, 메시지 최대 크기는? 특히 상태 토픽의 retained 사용 가능 여부가 "의도적 미배포 vs 장애" 구분 표시에 직접 영향을 준다. → D-5, I-10</w:t>
       </w:r>
     </w:p>
     <w:p>
@@ -3989,7 +3989,7 @@
         <w:pStyle w:val="ListBullet"/>
       </w:pPr>
       <w:r>
-        <w:t>Q14. MQTT ↔ OTel 브리지가 이미 있는가? 있다면 감사 기록을 가시화가 이중 발행할 필요가 없다. (D-8)</w:t>
+        <w:t>Q14. MQTT ↔ OTel 브리지가 이미 있는가? 있다면 감사 기록을 가시화가 이중 발행할 필요가 없다. → D-8</w:t>
       </w:r>
     </w:p>
     <w:p>
@@ -3997,7 +3997,7 @@
         <w:pStyle w:val="ListBullet"/>
       </w:pPr>
       <w:r>
-        <w:t>Q15. 명령의 ack/결과 규약은? MQTT 5의 response topic + correlation data를 쓰는가, /ack 하위 토픽 관례를 쓰는가?</w:t>
+        <w:t>Q15. 명령의 ack·결과 규약은? MQTT 5의 response topic과 correlation data를 쓰는가, /ack 하위 토픽 관례를 쓰는가?</w:t>
       </w:r>
     </w:p>
     <w:p>
@@ -4021,7 +4021,7 @@
         <w:pStyle w:val="ListBullet"/>
       </w:pPr>
       <w:r>
-        <w:t>Q18. 가시화가 구독할 토픽 수·초당 메시지량 예상치를 미리 제출하면 도움이 되는가? (O-4로 제출 가능)</w:t>
+        <w:t>Q18. 가시화가 구독할 토픽 수와 초당 메시지량 예상치를 미리 제출하면 도움이 되는가? O-4로 제출 가능하다.</w:t>
       </w:r>
     </w:p>
     <w:p>
@@ -4153,7 +4153,7 @@
                 <w:rFonts w:ascii="맑은 고딕" w:hAnsi="맑은 고딕" w:eastAsia="맑은 고딕"/>
                 <w:sz w:val="18"/>
               </w:rPr>
-              <w:t>O-1 제어 명령 스키마 + D-1 전달 채널</w:t>
+              <w:t>O-1 제어 명령 스키마와 D-1 전달 채널</w:t>
             </w:r>
           </w:p>
         </w:tc>
@@ -4215,7 +4215,7 @@
                 <w:rFonts w:ascii="맑은 고딕" w:hAnsi="맑은 고딕" w:eastAsia="맑은 고딕"/>
                 <w:sz w:val="18"/>
               </w:rPr>
-              <w:t>I-2 / D-3 식별자·토픽 체계 일원화</w:t>
+              <w:t>I-2 · D-3 식별자·토픽 체계 일원화</w:t>
             </w:r>
           </w:p>
         </w:tc>
@@ -4245,7 +4245,7 @@
                 <w:rFonts w:ascii="맑은 고딕" w:hAnsi="맑은 고딕" w:eastAsia="맑은 고딕"/>
                 <w:sz w:val="18"/>
               </w:rPr>
-              <w:t>임시 규약으로 진행 후 교체 (교체 비용 발생)</w:t>
+              <w:t>임시 규약으로 진행 후 교체. 교체 비용 발생</w:t>
             </w:r>
           </w:p>
         </w:tc>
@@ -4277,7 +4277,7 @@
                 <w:rFonts w:ascii="맑은 고딕" w:hAnsi="맑은 고딕" w:eastAsia="맑은 고딕"/>
                 <w:sz w:val="18"/>
               </w:rPr>
-              <w:t>D-2 / I-9 브라우저 실시간 구독 경로</w:t>
+              <w:t>D-2 · I-9 브라우저 실시간 구독 경로</w:t>
             </w:r>
           </w:p>
         </w:tc>
@@ -4307,7 +4307,7 @@
                 <w:rFonts w:ascii="맑은 고딕" w:hAnsi="맑은 고딕" w:eastAsia="맑은 고딕"/>
                 <w:sz w:val="18"/>
               </w:rPr>
-              <w:t>폴링으로 임시 동작 (해상도 저하)</w:t>
+              <w:t>폴링으로 임시 동작. 해상도 저하</w:t>
             </w:r>
           </w:p>
         </w:tc>
@@ -4401,7 +4401,7 @@
                 <w:rFonts w:ascii="맑은 고딕" w:hAnsi="맑은 고딕" w:eastAsia="맑은 고딕"/>
                 <w:sz w:val="18"/>
               </w:rPr>
-              <w:t>I-5 / I-6 감사 조회 · 권한</w:t>
+              <w:t>I-5 · I-6 감사 조회와 권한</w:t>
             </w:r>
           </w:p>
         </w:tc>
@@ -4463,7 +4463,7 @@
                 <w:rFonts w:ascii="맑은 고딕" w:hAnsi="맑은 고딕" w:eastAsia="맑은 고딕"/>
                 <w:sz w:val="18"/>
               </w:rPr>
-              <w:t>I-4 / D-4 스트림·영상</w:t>
+              <w:t>I-4 · D-4 스트림과 영상</w:t>
             </w:r>
           </w:p>
         </w:tc>
@@ -4525,7 +4525,7 @@
                 <w:rFonts w:ascii="맑은 고딕" w:hAnsi="맑은 고딕" w:eastAsia="맑은 고딕"/>
                 <w:sz w:val="18"/>
               </w:rPr>
-              <w:t>그 외 (I-3, I-7, I-8, O-2, O-3, O-5)</w:t>
+              <w:t>그 외 I-3, I-7, I-8, O-2, O-3, O-5</w:t>
             </w:r>
           </w:p>
         </w:tc>
@@ -4623,7 +4623,7 @@
         <w:pStyle w:val="ListBullet"/>
       </w:pPr>
       <w:r>
-        <w:t>질의 부하가 커지는 구성(짧은 폴링 주기 등)을 도입할 때 사전에 공유한다. O-4가 그 수단이다.</w:t>
+        <w:t>질의 부하가 커지는 구성을 도입할 때 사전에 공유한다. 짧은 폴링 주기 등이 해당하며, O-4가 그 수단이다.</w:t>
       </w:r>
     </w:p>
     <w:p>

</xml_diff>